<commit_message>
fix: verify multi-year report rendering
</commit_message>
<xml_diff>
--- a/data/templates/Multi-Year_Evaluation_Report-cwr-v1.docx
+++ b/data/templates/Multi-Year_Evaluation_Report-cwr-v1.docx
@@ -172,7 +172,6 @@
           <w:sz w:val="32"/>
           <w:szCs w:val="24"/>
         </w:rPr>
-        <w:t>[]</w:t>
       </w:r>
       <w:r>
         <w:rPr>
@@ -1290,6 +1289,7 @@
     </w:p>
     <w:p>
       <w:pPr>
+        <w:keepNext/>
         <w:widowControl/>
         <w:ind w:firstLineChars="100" w:firstLine="320"/>
         <w:jc w:val="center"/>
@@ -3848,6 +3848,7 @@
     </w:p>
     <w:p>
       <w:pPr>
+        <w:keepNext/>
         <w:widowControl/>
         <w:jc w:val="center"/>
         <w:rPr>
@@ -4635,6 +4636,7 @@
     </w:p>
     <w:p>
       <w:pPr>
+        <w:keepNext/>
         <w:jc w:val="center"/>
         <w:rPr>
           <w:rFonts w:ascii="仿宋_GB2312" w:eastAsia="仿宋_GB2312" w:hAnsi="Times New Roman" w:cs="Times New Roman"/>
@@ -5123,6 +5125,7 @@
     </w:p>
     <w:p>
       <w:pPr>
+        <w:keepNext/>
         <w:widowControl/>
         <w:jc w:val="center"/>
         <w:rPr>
@@ -5690,6 +5693,7 @@
     </w:p>
     <w:p>
       <w:pPr>
+        <w:keepNext/>
         <w:widowControl/>
         <w:jc w:val="center"/>
         <w:rPr>
@@ -5978,6 +5982,7 @@
     </w:p>
     <w:p>
       <w:pPr>
+        <w:keepNext/>
         <w:widowControl/>
         <w:jc w:val="center"/>
         <w:rPr>
@@ -7278,7 +7283,7 @@
         <w:autoSpaceDE w:val="0"/>
         <w:autoSpaceDN w:val="0"/>
         <w:adjustRightInd w:val="0"/>
-        <w:spacing w:line="360" w:lineRule="auto"/>
+        <w:spacing w:line="240" w:lineRule="auto"/>
         <w:rPr>
           <w:rFonts w:ascii="Times New Roman" w:eastAsia="宋体" w:hAnsi="Times New Roman" w:cs="Times New Roman"/>
           <w:kern w:val="0"/>
@@ -7363,7 +7368,7 @@
         <w:autoSpaceDE w:val="0"/>
         <w:autoSpaceDN w:val="0"/>
         <w:adjustRightInd w:val="0"/>
-        <w:spacing w:line="360" w:lineRule="auto"/>
+        <w:spacing w:line="240" w:lineRule="auto"/>
         <w:rPr>
           <w:rFonts w:ascii="Times New Roman" w:eastAsia="宋体" w:hAnsi="Times New Roman" w:cs="Times New Roman"/>
           <w:kern w:val="0"/>
@@ -7445,7 +7450,7 @@
           <w:ilvl w:val="0"/>
           <w:numId w:val="4"/>
         </w:numPr>
-        <w:spacing w:line="360" w:lineRule="auto"/>
+        <w:spacing w:line="240" w:lineRule="auto"/>
         <w:rPr>
           <w:rStyle w:val="a7"/>
           <w:rFonts w:ascii="Times New Roman" w:eastAsia="宋体" w:hAnsi="Times New Roman" w:cs="Times New Roman"/>

</xml_diff>